<commit_message>
Reorganize repo: move docs to docs/, clean up PAPER.md, update docx
- Move 10 markdown docs and paper.tex into docs/ folder
- Clean up PAPER.md: remove internal status notes, [GAP] markers, merge conclusions
- Update README.md links to reflect new docs/ paths
- Remove empty pytest-cache-files-* dirs and .pytest_cache
- Update docx title and remove template textbox

Co-authored-by: CommandCodeBot <noreply@commandcode.ai>
</commit_message>
<xml_diff>
--- a/Activation_Weighted_Low_Rank_Compression_Paper.docx
+++ b/Activation_Weighted_Low_Rank_Compression_Paper.docx
@@ -24,7 +24,7 @@
           <w:rFonts w:ascii="Times New Roman" w:hAnsi="Times New Roman"/>
           <w:sz w:val="48"/>
         </w:rPr>
-        <w:t>Activation-Weighted Low-Rank Fitting for Attention Output Projections: Can Compression Improve on the Teacher?</w:t>
+        <w:t>Activation-Weighted Low-Rank Fitting for Attention Output Projections</w:t>
       </w:r>
     </w:p>
     <w:p>
@@ -821,6 +821,57 @@
           <w:rFonts w:ascii="Times New Roman" w:hAnsi="Times New Roman"/>
         </w:rPr>
         <w:t>The weighted-vs-SVD gap is 5.9×, 16.2×, and 6.9× respectively. The pre-registered 7B gate returns SUPPORTS: the earlier “failure wall” at 3× was a property of the approximation norm, not of scale.</w:t>
+      </w:r>
+    </w:p>
+    <w:p>
+      <w:pPr>
+        <w:jc w:val="center"/>
+      </w:pPr>
+      <w:r>
+        <w:drawing>
+          <wp:inline>
+            <wp:extent cx="2988000" cy="2241000"/>
+            <wp:docPr id="1" name="Picture 1"/>
+            <wp:cNvGraphicFramePr>
+              <a:graphicFrameLocks noChangeAspect="1"/>
+            </wp:cNvGraphicFramePr>
+            <a:graphic>
+              <a:graphicData uri="http://schemas.openxmlformats.org/drawingml/2006/picture">
+                <pic:pic>
+                  <pic:nvPicPr>
+                    <pic:cNvPr id="0" name="_fig_main.png"/>
+                    <pic:cNvPicPr/>
+                  </pic:nvPicPr>
+                  <pic:blipFill>
+                    <a:blip r:embed="rId14"/>
+                    <a:stretch>
+                      <a:fillRect/>
+                    </a:stretch>
+                  </pic:blipFill>
+                  <pic:spPr>
+                    <a:xfrm>
+                      <a:off x="0" y="0"/>
+                      <a:ext cx="2988000" cy="2241000"/>
+                    </a:xfrm>
+                    <a:prstGeom prst="rect"/>
+                  </pic:spPr>
+                </pic:pic>
+              </a:graphicData>
+            </a:graphic>
+          </wp:inline>
+        </w:drawing>
+      </w:r>
+    </w:p>
+    <w:p>
+      <w:pPr>
+        <w:jc w:val="center"/>
+      </w:pPr>
+      <w:r>
+        <w:rPr>
+          <w:rFonts w:ascii="Times New Roman" w:hAnsi="Times New Roman"/>
+          <w:sz w:val="16"/>
+        </w:rPr>
+        <w:t>Fig. 1. Cross-scale perplexity delta at one-sided 3× rank on all attention output projections. The activation-weighted fit closes most of the gap plain SVD opens, and on Gemma-3-1B it improves on the teacher.</w:t>
       </w:r>
     </w:p>
     <w:p>
@@ -3186,154 +3237,6 @@
           </w:cols>
         </w:sectPr>
       </w:pPr>
-    </w:p>
-    <w:p>
-      <w:pPr>
-        <w:rPr/>
-      </w:pPr>
-      <w:r>
-        <w:rPr>
-          <w:rtl w:val="0"/>
-        </w:rPr>
-      </w:r>
-      <w:r>
-        <mc:AlternateContent>
-          <mc:Choice Requires="wps">
-            <w:drawing>
-              <wp:anchor allowOverlap="1" behindDoc="0" distB="0" distT="0" distL="114300" distR="114300" hidden="0" layoutInCell="1" locked="0" relativeHeight="0" simplePos="0">
-                <wp:simplePos x="0" y="0"/>
-                <wp:positionH relativeFrom="column">
-                  <wp:posOffset>2</wp:posOffset>
-                </wp:positionH>
-                <wp:positionV relativeFrom="paragraph">
-                  <wp:posOffset>0</wp:posOffset>
-                </wp:positionV>
-                <wp:extent cx="3200400" cy="1143000"/>
-                <wp:effectExtent b="0" l="0" r="0" t="0"/>
-                <wp:wrapSquare wrapText="bothSides" distB="0" distT="0" distL="114300" distR="114300"/>
-                <wp:docPr id="1" name=""/>
-                <a:graphic>
-                  <a:graphicData uri="http://schemas.microsoft.com/office/word/2010/wordprocessingShape">
-                    <wps:wsp>
-                      <wps:cNvSpPr/>
-                      <wps:spPr>
-                        <a:xfrm>
-                          <a:off x="0" y="0"/>
-                          <a:ext cx="3200400" cy="1143000"/>
-                        </a:xfrm>
-                        <a:prstGeom prst="rect">
-                          <a:avLst/>
-                        </a:prstGeom>
-                        <a:solidFill>
-                          <a:srgbClr val="FFFFFF"/>
-                        </a:solidFill>
-                        <a:ln cap="flat" cmpd="sng" w="9525">
-                          <a:solidFill>
-                            <a:srgbClr val="000000"/>
-                          </a:solidFill>
-                          <a:prstDash val="solid"/>
-                          <a:miter lim="800000"/>
-                          <a:headEnd len="sm" w="sm" type="none"/>
-                          <a:tailEnd len="sm" w="sm" type="none"/>
-                        </a:ln>
-                      </wps:spPr>
-                      <wps:txbx>
-                        <w:txbxContent>
-                          <w:p>
-                            <w:pPr>
-                              <w:spacing w:after="120" w:line="227" w:lineRule="auto"/>
-                              <w:ind w:firstLine="287"/>
-                              <w:jc w:val="both"/>
-                              <w:textDirection w:val="btLr"/>
-                            </w:pPr>
-                            <w:r>
-                              <w:rPr>
-                                <w:rFonts w:ascii="Arial" w:cs="Arial" w:eastAsia="Arial" w:hAnsi="Arial"/>
-                                <w:color w:val="000000"/>
-                                <w:sz w:val="28"/>
-                              </w:rPr>
-                              <w:t>We suggest that you use a text box to insert a graphic (which is ideally a 300 dpi TIFF or EPS file, with all fonts embedded) because, in an MSW document, this method is somewhat more stable than directly inserting a picture.</w:t>
-                            </w:r>
-                          </w:p>
-                          <w:p>
-                            <w:pPr>
-                              <w:spacing w:after="120" w:line="227" w:lineRule="auto"/>
-                              <w:ind w:firstLine="287"/>
-                              <w:jc w:val="both"/>
-                              <w:textDirection w:val="btLr"/>
-                            </w:pPr>
-                            <w:r>
-                              <w:rPr>
-                                <w:rFonts w:ascii="Arial" w:cs="Arial" w:eastAsia="Arial" w:hAnsi="Arial"/>
-                                <w:color w:val="000000"/>
-                                <w:sz w:val="28"/>
-                              </w:rPr>
-                              <w:t>To have non-visible rules on your frame, use the MSWord “Format” pull-down menu, select Text Box &gt; Colors and Lines to choose No Fill and No Line.</w:t>
-                            </w:r>
-                          </w:p>
-                          <w:p>
-                            <w:pPr>
-                              <w:spacing w:after="120" w:line="227" w:lineRule="auto"/>
-                              <w:ind w:firstLine="287"/>
-                              <w:jc w:val="both"/>
-                              <w:textDirection w:val="btLr"/>
-                            </w:pPr>
-                          </w:p>
-                        </w:txbxContent>
-                      </wps:txbx>
-                      <wps:bodyPr anchorCtr="0" anchor="t" bIns="45700" lIns="91425" spcFirstLastPara="1" rIns="91425" wrap="square" tIns="45700">
-                        <a:noAutofit/>
-                      </wps:bodyPr>
-                    </wps:wsp>
-                  </a:graphicData>
-                </a:graphic>
-              </wp:anchor>
-            </w:drawing>
-          </mc:Choice>
-          <mc:Fallback>
-            <w:drawing>
-              <wp:anchor allowOverlap="1" behindDoc="0" distB="0" distT="0" distL="114300" distR="114300" hidden="0" layoutInCell="1" locked="0" relativeHeight="0" simplePos="0">
-                <wp:simplePos x="0" y="0"/>
-                <wp:positionH relativeFrom="column">
-                  <wp:posOffset>2</wp:posOffset>
-                </wp:positionH>
-                <wp:positionV relativeFrom="paragraph">
-                  <wp:posOffset>0</wp:posOffset>
-                </wp:positionV>
-                <wp:extent cx="3200400" cy="1143000"/>
-                <wp:effectExtent b="0" l="0" r="0" t="0"/>
-                <wp:wrapSquare wrapText="bothSides" distB="0" distT="0" distL="114300" distR="114300"/>
-                <wp:docPr id="1" name="image1.png"/>
-                <a:graphic>
-                  <a:graphicData uri="http://schemas.openxmlformats.org/drawingml/2006/picture">
-                    <pic:pic>
-                      <pic:nvPicPr>
-                        <pic:cNvPr id="0" name="image1.png"/>
-                        <pic:cNvPicPr preferRelativeResize="0"/>
-                      </pic:nvPicPr>
-                      <pic:blipFill>
-                        <a:blip r:embed="rId13"/>
-                        <a:srcRect b="0" l="0" r="0" t="0"/>
-                        <a:stretch>
-                          <a:fillRect/>
-                        </a:stretch>
-                      </pic:blipFill>
-                      <pic:spPr>
-                        <a:xfrm>
-                          <a:off x="0" y="0"/>
-                          <a:ext cx="3200400" cy="1143000"/>
-                        </a:xfrm>
-                        <a:prstGeom prst="rect"/>
-                        <a:ln/>
-                      </pic:spPr>
-                    </pic:pic>
-                  </a:graphicData>
-                </a:graphic>
-              </wp:anchor>
-            </w:drawing>
-          </mc:Fallback>
-        </mc:AlternateContent>
-      </w:r>
     </w:p>
     <w:sectPr>
       <w:type w:val="continuous"/>

</xml_diff>